<commit_message>
Mountains Part 3: ladder needs one Tier 4, 250 points; updated proposal download
</commit_message>
<xml_diff>
--- a/assets/docs/14-peaks-access-rules.docx
+++ b/assets/docs/14-peaks-access-rules.docx
@@ -45,7 +45,7 @@
           <w:sz w:val="24"/>
           <w:szCs w:val="24"/>
         </w:rPr>
-        <w:t xml:space="preserve">Level 1 Framework — Draft v2.1 for Discussion</w:t>
+        <w:t xml:space="preserve">Level 1 Framework — Draft v2.2 for Discussion</w:t>
       </w:r>
     </w:p>
     <w:p>
@@ -178,7 +178,7 @@
         <w:t xml:space="preserve">The Qualification Ladder. </w:t>
       </w:r>
       <w:r>
-        <w:t xml:space="preserve">A scored progression across lesser peaks: seven qualifying summits, 320 points and at least 100 nights slept above 5,000 m in no less than three years for Everest. It adds an independent medical clearance, a practical skills check, and a currency rule. Money can buy guides and oxygen but cannot buy nights at altitude, no-O₂ summits, or verified performance.</w:t>
+        <w:t xml:space="preserve">A scored progression across lesser peaks: six qualifying summits, 250 points and at least 100 nights slept above 5,000 m in no less than three years for Everest. It adds an independent medical clearance, a practical skills check, and a currency rule. Money can buy guides and oxygen but cannot buy nights at altitude, no-O₂ summits, or verified performance.</w:t>
       </w:r>
     </w:p>
     <w:p>
@@ -226,7 +226,7 @@
         <w:spacing w:after="120"/>
       </w:pPr>
       <w:r>
-        <w:t xml:space="preserve">Economically, the rules move demand down the mountain instead of removing it. Every Everest hopeful must climb about seven qualifying expeditions over at least three years first, at least two of them in Nepal. That spreads guide, porter, lodge and royalty income across more peaks, more valleys and more months.</w:t>
+        <w:t xml:space="preserve">Economically, the rules move demand down the mountain instead of removing it. Every Everest hopeful must climb about six qualifying expeditions over at least three years first, at least two of them in Nepal. That spreads guide, porter, lodge and royalty income across more peaks, more valleys and more months.</w:t>
       </w:r>
     </w:p>
     <w:p>
@@ -12889,7 +12889,7 @@
                 <w:sz w:val="17"/>
                 <w:szCs w:val="17"/>
               </w:rPr>
-              <w:t xml:space="preserve">3 × T2 (one ≥ AD−) + 2 × T3 (both ≥ 7,000 m) + 2 × T4 (one 8,000 m, one graded ≥ D)  (v1: 4 summits)</w:t>
+              <w:t xml:space="preserve">3 × T2 (one ≥ AD−) + 2 × T3 (both ≥ 7,000 m) + 1 × T4 (an 8,000 m peak or a technical peak graded ≥ D)  (v1: 4 summits)</w:t>
             </w:r>
           </w:p>
         </w:tc>
@@ -13008,7 +13008,7 @@
                 <w:sz w:val="17"/>
                 <w:szCs w:val="17"/>
               </w:rPr>
-              <w:t xml:space="preserve">≥ 320  (v1: 160)</w:t>
+              <w:t xml:space="preserve">≥ 250  (v1: 160)</w:t>
             </w:r>
           </w:p>
         </w:tc>
@@ -14243,7 +14243,7 @@
                 <w:sz w:val="18"/>
                 <w:szCs w:val="18"/>
               </w:rPr>
-              <w:t xml:space="preserve">7</w:t>
+              <w:t xml:space="preserve">6</w:t>
             </w:r>
           </w:p>
         </w:tc>
@@ -14272,7 +14272,7 @@
                 <w:sz w:val="18"/>
                 <w:szCs w:val="18"/>
               </w:rPr>
-              <w:t xml:space="preserve">1.75×</w:t>
+              <w:t xml:space="preserve">1.5×</w:t>
             </w:r>
           </w:p>
         </w:tc>
@@ -14364,7 +14364,7 @@
                 <w:sz w:val="18"/>
                 <w:szCs w:val="18"/>
               </w:rPr>
-              <w:t xml:space="preserve">320</w:t>
+              <w:t xml:space="preserve">250</w:t>
             </w:r>
           </w:p>
         </w:tc>
@@ -14394,7 +14394,7 @@
                 <w:sz w:val="18"/>
                 <w:szCs w:val="18"/>
               </w:rPr>
-              <w:t xml:space="preserve">2.0×</w:t>
+              <w:t xml:space="preserve">1.56×</w:t>
             </w:r>
           </w:p>
         </w:tc>
@@ -14897,7 +14897,7 @@
         <w:t xml:space="preserve">Why the waiting period stays at 3 years: </w:t>
       </w:r>
       <w:r>
-        <w:t xml:space="preserve">the extra effort has to fit inside the same 3 years. Seven qualifying expeditions and 100 nights above 5,000 m in 36 months works out to two to three expeditions and about 33 nights at altitude every year, or roughly 10–12 weeks on expedition. Only someone who really wants it keeps that up. A longer wait would add little, because a wealthy applicant can simply wait it out, and it would mostly hurt late starters.</w:t>
+        <w:t xml:space="preserve">the extra effort has to fit inside the same 3 years. Six qualifying expeditions and 100 nights above 5,000 m in 36 months works out to two expeditions and about 33 nights at altitude every year, or roughly 8–10 weeks on expedition. Only someone who really wants it keeps that up. A longer wait would add little, because a wealthy applicant can simply wait it out, and it would mostly hurt late starters.</w:t>
       </w:r>
     </w:p>
     <w:p>
@@ -14912,7 +14912,7 @@
         <w:t xml:space="preserve">Example Everest path (v2): </w:t>
       </w:r>
       <w:r>
-        <w:t xml:space="preserve">Island Peak (32.7) → Lobuche East (34.2, AD−) → Aconcagua (37.6) → Putha Hiunchuli (46.5, no O₂) → Baruntse (51.3, lean expedition) → Ama Dablam (56.1, D+) → Manaslu (62.6, 8,000 m) = 321.0 points and roughly 105–115 nights above 5,000 m. Two of the qualifiers are in Nepal. A sample schedule inside the 3 years: Island Peak (autumn, Year 1) · Aconcagua (southern summer) · Lobuche East and Putha Hiunchuli (spring, Year 2) · Ama Dablam and Baruntse (autumn, Year 2) · Manaslu (autumn, Year 3). The climber applies once 36 months have passed since the Island Peak summit.</w:t>
+        <w:t xml:space="preserve">Island Peak (32.7) → Lobuche East (34.2, AD−) → Aconcagua (37.6) → Putha Hiunchuli (46.5, no O₂) → Baruntse (51.3, lean expedition) → Ama Dablam (56.1, D+) = 258.4 points and roughly 85–95 nights above 5,000 m. A currency expedition or a turnaround attempt makes up the remaining nights. Manaslu (62.6, 8,000 m) can replace Ama Dablam for 264.9 points. Two of the qualifiers are in Nepal. A sample schedule inside the 3 years: Island Peak (autumn, Year 1) · Aconcagua (southern summer) · Lobuche East and Putha Hiunchuli (spring, Year 2) · Ama Dablam and Baruntse (autumn, Year 2) · a currency trip in Year 3 to build nights. The climber applies once 36 months have passed since the Island Peak summit.</w:t>
       </w:r>
     </w:p>
     <w:p>
@@ -19238,7 +19238,7 @@
         <w:t xml:space="preserve">Climbers with limited leave. </w:t>
       </w:r>
       <w:r>
-        <w:t xml:space="preserve">Seven expeditions (3–7 weeks each) in three years means about 10–12 weeks of leave a year. Mitigation: closer-to-home equivalents (Denali, Aconcagua, Lenin Peak) count, and autumn 7,000 m seasons are cheaper.</w:t>
+        <w:t xml:space="preserve">Six expeditions (3–7 weeks each) in three years means about 8–10 weeks of leave a year. Mitigation: closer-to-home equivalents (Denali, Aconcagua, Lenin Peak) count, and autumn 7,000 m seasons are cheaper.</w:t>
       </w:r>
     </w:p>
     <w:p>
@@ -24824,7 +24824,7 @@
         <w:t xml:space="preserve">The ladder creates demand. </w:t>
       </w:r>
       <w:r>
-        <w:t xml:space="preserve">Each Everest hopeful buys about seven qualifying expeditions (three T2, two T3, two T4) over at least three years before the Everest attempt, plus currency expeditions while waiting for a tag. Unsuccessful lottery applicants stay in the pipeline and keep climbing to keep their skills and medical status current.</w:t>
+        <w:t xml:space="preserve">Each Everest hopeful buys about six qualifying expeditions (three T2, two T3, one T4) over at least three years before the Everest attempt, plus currency expeditions while waiting for a tag. Unsuccessful lottery applicants stay in the pipeline and keep climbing to keep their skills and medical status current.</w:t>
       </w:r>
     </w:p>
     <w:p>
@@ -25592,7 +25592,7 @@
           <w:sz w:val="20"/>
           <w:szCs w:val="20"/>
         </w:rPr>
-        <w:t xml:space="preserve">Assumptions are placeholders for Level 2. The bigger effect is not royalty but total expedition spending and staff-days. A guided 7,000 m expedition typically employs a climbing Sherpa per client plus a cook, kitchen staff and porters for 3–5 weeks. Seven ladder expeditions per Everest climber add more staff-days than are lost by cutting about 135 Everest members per season.</w:t>
+        <w:t xml:space="preserve">Assumptions are placeholders for Level 2. The bigger effect is not royalty but total expedition spending and staff-days. A guided 7,000 m expedition typically employs a climbing Sherpa per client plus a cook, kitchen staff and porters for 3–5 weeks. Six ladder expeditions per Everest climber add more staff-days than are lost by cutting about 135 Everest members per season.</w:t>
       </w:r>
     </w:p>
     <w:p>

</xml_diff>

<commit_message>
Mountains series: new Part 3 (the numbers), Access Rules move to Part 4 (v3), Parts 1-2 cross-links
</commit_message>
<xml_diff>
--- a/assets/docs/14-peaks-access-rules.docx
+++ b/assets/docs/14-peaks-access-rules.docx
@@ -45,7 +45,7 @@
           <w:sz w:val="24"/>
           <w:szCs w:val="24"/>
         </w:rPr>
-        <w:t xml:space="preserve">Level 1 Framework — Draft v2.2 for Discussion</w:t>
+        <w:t>Level 1 Framework — Draft v3.0 for Discussion</w:t>
       </w:r>
     </w:p>
     <w:p>
@@ -58,7 +58,7 @@
           <w:sz w:val="22"/>
           <w:szCs w:val="22"/>
         </w:rPr>
-        <w:t xml:space="preserve">22 October 2026</w:t>
+        <w:t>24 October 2026</w:t>
       </w:r>
     </w:p>
     <w:p>
@@ -178,7 +178,7 @@
         <w:t xml:space="preserve">The Qualification Ladder. </w:t>
       </w:r>
       <w:r>
-        <w:t xml:space="preserve">A scored progression across lesser peaks: six qualifying summits, 250 points and at least 100 nights slept above 5,000 m in no less than three years for Everest. It adds an independent medical clearance, a practical skills check, and a currency rule. Money can buy guides and oxygen but cannot buy nights at altitude, no-O₂ summits, or verified performance.</w:t>
+        <w:t>A scored progression across lesser peaks: six qualifying summits, 250 points and at least 100 nights slept above 5,000 m in no less than three years for Everest. It adds an independent medical clearance, a practical skills check, and a currency rule. Money can buy guides but cannot buy nights at altitude, on-time summits, or verified performance.</w:t>
       </w:r>
     </w:p>
     <w:p>
@@ -198,7 +198,7 @@
         <w:t xml:space="preserve">The Summit Slot. </w:t>
       </w:r>
       <w:r>
-        <w:t xml:space="preserve">A second lottery at Base Camp that assigns each tag holder a summit day and start wave when the weather window opens, with a hard daily cap and gated checkpoints at the high camps.</w:t>
+        <w:t>A second lottery at Base Camp that assigns each tag holder a summit day and start wave when the weather window opens, with a hard daily cap and gated checkpoints at the high camps. Every summit day runs on a hard clock: summit by 11:00 or turn back.</w:t>
       </w:r>
     </w:p>
     <w:p>
@@ -227,6 +227,131 @@
       </w:pPr>
       <w:r>
         <w:t xml:space="preserve">Economically, the rules move demand down the mountain instead of removing it. Every Everest hopeful must climb about six qualifying expeditions over at least three years first, at least two of them in Nepal. That spreads guide, porter, lodge and royalty income across more peaks, more valleys and more months.</w:t>
+      </w:r>
+    </w:p>
+    <w:p>
+      <w:pPr>
+        <w:pStyle w:val="Heading2"/>
+      </w:pPr>
+      <w:r>
+        <w:rPr/>
+        <w:t>1.1 What the numbers changed (v3)</w:t>
+      </w:r>
+    </w:p>
+    <w:p>
+      <w:pPr>
+        <w:spacing w:after="120"/>
+      </w:pPr>
+      <w:r>
+        <w:rPr/>
+        <w:t>Version 3 tests the rules against an independent extension of the 2012 BMJ study of Himalayan survival, using the Himalayan Database through 2025 (Mountains, Part 3). Four findings changed the design:</w:t>
+      </w:r>
+    </w:p>
+    <w:p>
+      <w:pPr>
+        <w:pStyle w:val="ListParagraph"/>
+        <w:numPr>
+          <w:ilvl w:val="0"/>
+          <w:numId w:val="4"/>
+        </w:numPr>
+        <w:spacing w:after="60"/>
+      </w:pPr>
+      <w:r>
+        <w:rPr>
+          <w:b/>
+          <w:bCs/>
+        </w:rPr>
+        <w:t xml:space="preserve">Experience does not lower the odds of dying. </w:t>
+      </w:r>
+      <w:r>
+        <w:rPr>
+          <w:bCs/>
+        </w:rPr>
+        <w:t>Prior Himalayan expeditions made no difference to a client’s risk of death (odds ratio 0.99 per expedition). The Qualification Ladder stays, but its job is to limit and gate access to the 14 Peaks, not to make each climber safer.</w:t>
+      </w:r>
+    </w:p>
+    <w:p>
+      <w:pPr>
+        <w:pStyle w:val="ListParagraph"/>
+        <w:numPr>
+          <w:ilvl w:val="0"/>
+          <w:numId w:val="4"/>
+        </w:numPr>
+        <w:spacing w:after="60"/>
+      </w:pPr>
+      <w:r>
+        <w:rPr>
+          <w:b/>
+          <w:bCs/>
+        </w:rPr>
+        <w:t xml:space="preserve">The clock is the strongest safety lever. </w:t>
+      </w:r>
+      <w:r>
+        <w:rPr>
+          <w:bCs/>
+        </w:rPr>
+        <w:t>Each hour later on the summit raises the odds of dying on the descent by about 40%. Since 2010, summiters on the 8,000 m peaks who topped out after 11:00 were 18% of summiters but 63% of descent deaths (28 per 1,000 against 3.6 for earlier summiters). The hard turnaround (SG-4) becomes the core control, and late summits earn no ladder credit (PB-4).</w:t>
+      </w:r>
+    </w:p>
+    <w:p>
+      <w:pPr>
+        <w:pStyle w:val="ListParagraph"/>
+        <w:numPr>
+          <w:ilvl w:val="0"/>
+          <w:numId w:val="4"/>
+        </w:numPr>
+        <w:spacing w:after="60"/>
+      </w:pPr>
+      <w:r>
+        <w:rPr>
+          <w:b/>
+          <w:bCs/>
+        </w:rPr>
+        <w:t xml:space="preserve">Busy days are not the deadliest days. </w:t>
+      </w:r>
+      <w:r>
+        <w:rPr>
+          <w:bCs/>
+        </w:rPr>
+        <w:t>The busiest summit days are the good-weather days, and in 2020–25 they were the safest per climber. The daily cap therefore spaces climbers and gates access; it must never push a team onto a marginal day. Slots are issued only inside a declared window (7.1).</w:t>
+      </w:r>
+    </w:p>
+    <w:p>
+      <w:pPr>
+        <w:pStyle w:val="ListParagraph"/>
+        <w:numPr>
+          <w:ilvl w:val="0"/>
+          <w:numId w:val="4"/>
+        </w:numPr>
+        <w:spacing w:after="60"/>
+      </w:pPr>
+      <w:r>
+        <w:rPr>
+          <w:b/>
+          <w:bCs/>
+        </w:rPr>
+        <w:t xml:space="preserve">The no-oxygen qualifier is removed. </w:t>
+      </w:r>
+      <w:r>
+        <w:rPr>
+          <w:bCs/>
+        </w:rPr>
+        <w:t>Supported climbs were consistently safer in the data, so the ladder no longer requires a summit without supplemental oxygen, and oxygen start altitude no longer affects credit.</w:t>
+      </w:r>
+    </w:p>
+    <w:p>
+      <w:pPr>
+        <w:spacing w:after="120"/>
+      </w:pPr>
+      <w:r>
+        <w:rPr>
+          <w:b/>
+        </w:rPr>
+        <w:t xml:space="preserve">The risk-taking concern. </w:t>
+      </w:r>
+      <w:r>
+        <w:rPr/>
+        <w:t>The data suggest experienced climbers do not survive better partly because they take more risk. Before 2010 they turned back more often on the days people died and died less often on those days, but over a career that advantage was spent on harder peaks, climbs without oxygen and staying high to help others. A ladder that produces more experienced climbers could produce more of that risk-taking. The v3 rules aim to offset it on summit day: a fixed start wave and an 11:00 turnaround for everyone, credit for correct turnarounds (PB-10) and none for late summits (PB-4), and fewer people on the ridge, so climbers can get down faster. Whether these offsets work is untested; Level 2 should measure summit and descent times under the rules.</w:t>
       </w:r>
     </w:p>
     <w:p>
@@ -1584,7 +1709,7 @@
         <w:t xml:space="preserve">What the data says: </w:t>
       </w:r>
       <w:r>
-        <w:t xml:space="preserve">the season total is manageable. The daily load is what kills. Even 495 members plus about 1.5 staff each puts more than 1,200 people on the route. When only six to ten summit days open, most of them try to go on two or three of those days.</w:t>
+        <w:t>the season total is manageable. The daily load is what builds the queues that push summit times late, and late summits are what kill. Even 495 members plus about 1.5 staff each puts more than 1,200 people on the route. When only six to ten summit days open, most of them try to go on two or three of those days.</w:t>
       </w:r>
     </w:p>
     <w:p>
@@ -2112,10 +2237,10 @@
           <w:b/>
           <w:bCs/>
         </w:rPr>
-        <w:t xml:space="preserve">Cap the day, not just the season. </w:t>
-      </w:r>
-      <w:r>
-        <w:t xml:space="preserve">Crowding deaths happen on summit day. The daily cap is the core control.</w:t>
+        <w:t xml:space="preserve">Control the summit clock. </w:t>
+      </w:r>
+      <w:r>
+        <w:t>Deaths cluster on summit day, and the later the summit, the deadlier the descent. The hard turnaround, kept on schedule by start waves and a daily cap, is the core control.</w:t>
       </w:r>
     </w:p>
     <w:p>
@@ -12535,6 +12660,25 @@
     </w:p>
     <w:p>
       <w:pPr>
+        <w:pBdr>
+          <w:left w:val="single" w:color="C9A227" w:sz="18" w:space="6"/>
+        </w:pBdr>
+        <w:shd w:fill="FFF4D6" w:color="auto" w:val="clear"/>
+        <w:spacing w:after="160" w:before="60"/>
+        <w:ind w:left="120"/>
+      </w:pPr>
+      <w:r>
+        <w:rPr>
+          <w:i/>
+          <w:iCs/>
+          <w:sz w:val="20"/>
+          <w:szCs w:val="20"/>
+        </w:rPr>
+        <w:t>Version 3 (24 Oct 2026): the no-oxygen qualifier and the oxygen-start rule are removed. PB-4 now denies credit for late summits, PB-7 requires logged summit and turnaround times, and the summit-day clock becomes the core safety control (see 1.1).</w:t>
+      </w:r>
+    </w:p>
+    <w:p>
+      <w:pPr>
         <w:pStyle w:val="Heading2"/>
       </w:pPr>
       <w:r>
@@ -13609,7 +13753,7 @@
                 <w:sz w:val="17"/>
                 <w:szCs w:val="17"/>
               </w:rPr>
-              <w:t xml:space="preserve">One T3 without supplemental O₂ AND one T3 on a lean expedition: no better than 1 staff per 2 members below high camp, climber carries own personal gear</w:t>
+              <w:t>One T3 on a lean expedition: no better than 1 staff per 2 members below high camp, climber carries own personal gear. Every qualifying summit must be reached before the peak’s posted turnaround time</w:t>
             </w:r>
           </w:p>
         </w:tc>
@@ -14665,7 +14809,7 @@
                 <w:sz w:val="18"/>
                 <w:szCs w:val="18"/>
               </w:rPr>
-              <w:t xml:space="preserve">Lean / no-O₂ qualifiers</w:t>
+              <w:t>Lean qualifiers (no-O₂ removed in v3)</w:t>
             </w:r>
           </w:p>
         </w:tc>
@@ -14694,7 +14838,7 @@
                 <w:sz w:val="18"/>
                 <w:szCs w:val="18"/>
               </w:rPr>
-              <w:t xml:space="preserve">1</w:t>
+              <w:t>1</w:t>
             </w:r>
           </w:p>
         </w:tc>
@@ -14723,7 +14867,7 @@
                 <w:sz w:val="18"/>
                 <w:szCs w:val="18"/>
               </w:rPr>
-              <w:t xml:space="preserve">2</w:t>
+              <w:t>1</w:t>
             </w:r>
           </w:p>
         </w:tc>
@@ -14752,7 +14896,7 @@
                 <w:sz w:val="18"/>
                 <w:szCs w:val="18"/>
               </w:rPr>
-              <w:t xml:space="preserve">2.0×</w:t>
+              <w:t>1.0×</w:t>
             </w:r>
           </w:p>
         </w:tc>
@@ -14909,10 +15053,10 @@
           <w:b/>
           <w:bCs/>
         </w:rPr>
-        <w:t xml:space="preserve">Example Everest path (v2): </w:t>
-      </w:r>
-      <w:r>
-        <w:t xml:space="preserve">Island Peak (32.7) → Lobuche East (34.2, AD−) → Aconcagua (37.6) → Putha Hiunchuli (46.5, no O₂) → Baruntse (51.3, lean expedition) → Ama Dablam (56.1, D+) = 258.4 points and roughly 85–95 nights above 5,000 m. A currency expedition or a turnaround attempt makes up the remaining nights. Manaslu (62.6, 8,000 m) can replace Ama Dablam for 264.9 points. Two of the qualifiers are in Nepal. A sample schedule inside the 3 years: Island Peak (autumn, Year 1) · Aconcagua (southern summer) · Lobuche East and Putha Hiunchuli (spring, Year 2) · Ama Dablam and Baruntse (autumn, Year 2) · a currency trip in Year 3 to build nights. The climber applies once 36 months have passed since the Island Peak summit.</w:t>
+        <w:t xml:space="preserve">Example Everest path (v3): </w:t>
+      </w:r>
+      <w:r>
+        <w:t>Island Peak (32.7) → Lobuche East (34.2, AD−) → Aconcagua (37.6) → Putha Hiunchuli (46.5) → Baruntse (51.3, lean expedition) → Ama Dablam (56.1, D+) = 258.4 points and roughly 85–95 nights above 5,000 m. A currency expedition or a turnaround attempt makes up the remaining nights. Manaslu (62.6, 8,000 m) can replace Ama Dablam for 264.9 points. Two of the qualifiers are in Nepal. A sample schedule inside the 3 years: Island Peak (autumn, Year 1) · Aconcagua (southern summer) · Lobuche East and Putha Hiunchuli (spring, Year 2) · Ama Dablam and Baruntse (autumn, Year 2) · a currency trip in Year 3 to build nights. The climber applies once 36 months have passed since the Island Peak summit.</w:t>
       </w:r>
     </w:p>
     <w:p>
@@ -15008,7 +15152,7 @@
         <w:t xml:space="preserve">PB-4	</w:t>
       </w:r>
       <w:r>
-        <w:t xml:space="preserve">No credit if supplemental O₂ was started below 7,000 m on a T3 or T4 qualifier.</w:t>
+        <w:t>Late summits earn no credit. A qualifying summit reached after the peak’s posted turnaround time, as logged by tracker, earns no points, even if the climber gets down safely. Nights on the climb still count.</w:t>
       </w:r>
     </w:p>
     <w:p>
@@ -15075,7 +15219,7 @@
         <w:t xml:space="preserve">PB-7	</w:t>
       </w:r>
       <w:r>
-        <w:t xml:space="preserve">Every qualifying climb must disclose its support level: staff ratio, O₂ start altitude and flow, helicopter use, and any pre-acclimatization protocol (with device logs). A false disclosure is fraud.</w:t>
+        <w:t>Every qualifying climb must disclose its support level: staff ratio, summit and turnaround times, helicopter use, and any pre-acclimatization protocol (with device logs). A false disclosure is fraud.</w:t>
       </w:r>
     </w:p>
     <w:p>
@@ -18473,7 +18617,7 @@
                 <w:sz w:val="16"/>
                 <w:szCs w:val="16"/>
               </w:rPr>
-              <w:t xml:space="preserve">No-O₂ 7,000 m + lean expedition</w:t>
+              <w:t>Lean expedition + on-time summits</w:t>
             </w:r>
           </w:p>
         </w:tc>
@@ -18502,7 +18646,7 @@
                 <w:sz w:val="16"/>
                 <w:szCs w:val="16"/>
               </w:rPr>
-              <w:t xml:space="preserve">Climbers who rely on staff and oxygen</w:t>
+              <w:t>Climbers who rely on staff cushioning or summit late</w:t>
             </w:r>
           </w:p>
         </w:tc>
@@ -18531,7 +18675,7 @@
                 <w:sz w:val="16"/>
                 <w:szCs w:val="16"/>
               </w:rPr>
-              <w:t xml:space="preserve">No: the support is limited by rule</w:t>
+              <w:t>No: support and summit times are logged</w:t>
             </w:r>
           </w:p>
         </w:tc>
@@ -18560,7 +18704,7 @@
                 <w:sz w:val="16"/>
                 <w:szCs w:val="16"/>
               </w:rPr>
-              <w:t xml:space="preserve">Small extra risk on the qualifier</w:t>
+              <w:t>Small extra risk on the lean qualifier</w:t>
             </w:r>
           </w:p>
         </w:tc>
@@ -19210,7 +19354,7 @@
         <w:t xml:space="preserve">Conclusion. </w:t>
       </w:r>
       <w:r>
-        <w:t xml:space="preserve">The real filter is repeated, personal discomfort over years. That means about 100+ nights above 5,000 m, at least one summit without oxygen or staff cushioning, coming back after a failure, and staying current through years of lottery waiting. Money pays for every one of those expeditions, but it cannot sleep the nights or climb the steps for the climber. Someone who completes all of it has shown desire, and the rules should not try to keep them off the mountain because they are wealthy.</w:t>
+        <w:t>The real filter is repeated, personal discomfort over years. That means about 100+ nights above 5,000 m, at least one summit without staff cushioning, a record of on-time summits, coming back after a failure, and staying current through years of lottery waiting. Money pays for every one of those expeditions, but it cannot sleep the nights or climb the steps for the climber. Someone who completes all of it has shown desire, and the rules should not try to keep them off the mountain because they are wealthy.</w:t>
       </w:r>
     </w:p>
     <w:p>
@@ -22840,7 +22984,7 @@
         <w:t xml:space="preserve">Window declared. </w:t>
       </w:r>
       <w:r>
-        <w:t xml:space="preserve">When the official forecast meets the window criteria (for example, summit winds below 30 mph for 24 hours or more), the Cell publishes the number of summit days × the daily cap.</w:t>
+        <w:t>When the official forecast meets the window criteria (for example, summit winds below 30 mph for 24 hours or more), the Cell publishes the number of summit days × the daily cap. Slots are issued only for days inside the declared window. No team is assigned a marginal day to fill the cap.</w:t>
       </w:r>
     </w:p>
     <w:p>
@@ -23036,7 +23180,7 @@
         <w:t xml:space="preserve">Hard turnaround: </w:t>
       </w:r>
       <w:r>
-        <w:t xml:space="preserve">South Summit checkpoint by 09:00 and summit by 11:00, or turn back. Times are logged by tracker.</w:t>
+        <w:t>South Summit checkpoint by 09:00 and summit by 11:00, or turn back. Times are logged by tracker. This is the core safety control: since 2010, climbers who summited after 11:00 died on the descent at about eight times the rate of earlier summiters (28 vs 3.6 per 1,000).</w:t>
       </w:r>
     </w:p>
     <w:p>

</xml_diff>

<commit_message>
Mountains Part 3: altitude experience, descent causes, 7,000 m peaks; Part 4: Access Rules v3.1
</commit_message>
<xml_diff>
--- a/assets/docs/14-peaks-access-rules.docx
+++ b/assets/docs/14-peaks-access-rules.docx
@@ -45,7 +45,7 @@
           <w:sz w:val="24"/>
           <w:szCs w:val="24"/>
         </w:rPr>
-        <w:t>Level 1 Framework — Draft v3.0 for Discussion</w:t>
+        <w:t>Level 1 Framework — Draft v3.1 for Discussion</w:t>
       </w:r>
     </w:p>
     <w:p>
@@ -235,7 +235,7 @@
       </w:pPr>
       <w:r>
         <w:rPr/>
-        <w:t>1.1 What the numbers changed (v3)</w:t>
+        <w:t>1.1 What the numbers changed (v3, v3.1)</w:t>
       </w:r>
     </w:p>
     <w:p>
@@ -244,7 +244,7 @@
       </w:pPr>
       <w:r>
         <w:rPr/>
-        <w:t>Version 3 tests the rules against an independent extension of the 2012 BMJ study of Himalayan survival, using the Himalayan Database through 2025 (Mountains, Part 3). Four findings changed the design:</w:t>
+        <w:t>Version 3 tests the rules against an independent extension of the 2012 BMJ study of Himalayan survival, using the Himalayan Database through 2025 (Mountains, Part 3). Six findings changed the design:</w:t>
       </w:r>
     </w:p>
     <w:p>
@@ -261,13 +261,13 @@
           <w:b/>
           <w:bCs/>
         </w:rPr>
-        <w:t xml:space="preserve">Experience does not lower the odds of dying. </w:t>
+        <w:t xml:space="preserve">Expedition count doesn’t lower the odds of dying, but altitude experience may. </w:t>
       </w:r>
       <w:r>
         <w:rPr>
           <w:bCs/>
         </w:rPr>
-        <w:t>Prior Himalayan expeditions made no difference to a client’s risk of death (odds ratio 0.99 per expedition). The Qualification Ladder stays, but its job is to limit and gate access to the 14 Peaks, not to make each climber safer.</w:t>
+        <w:t>The number of prior Himalayan expeditions made no difference to a client’s risk of death (odds ratio 0.99 per expedition). The height of prior summits did on modern Everest: since 2010, climbers who had already summited a peak of 7,000 m or higher died about half as often (0.6% vs 1.2%; odds ratio 0.42), and a 7,000 m summit counted about as much as an 8,000 m one. For paying clients alone the estimate is similar but not yet statistically conclusive. The Qualification Ladder limits and gates access, and its 7,000 m rungs now have a safety reason too.</w:t>
       </w:r>
     </w:p>
     <w:p>
@@ -337,6 +337,52 @@
           <w:bCs/>
         </w:rPr>
         <w:t>Supported climbs were consistently safer in the data, so the ladder no longer requires a summit without supplemental oxygen, and oxygen start altitude no longer affects credit.</w:t>
+      </w:r>
+    </w:p>
+    <w:p>
+      <w:pPr>
+        <w:pStyle w:val="ListParagraph"/>
+        <w:numPr>
+          <w:ilvl w:val="0"/>
+          <w:numId w:val="4"/>
+        </w:numPr>
+        <w:spacing w:after="60"/>
+      </w:pPr>
+      <w:r>
+        <w:rPr>
+          <w:b/>
+          <w:bCs/>
+        </w:rPr>
+        <w:t xml:space="preserve">The lean qualifier moves down to Tier 2. </w:t>
+      </w:r>
+      <w:r>
+        <w:rPr>
+          <w:bCs/>
+        </w:rPr>
+        <w:t>Unsupported climbing on non-commercial 7,000 m peaks was about as deadly per climber as Everest and ten times deadlier than guided climbing on the commercial 7,000 m peaks (1.1% vs 0.12% of climbers died). The “carry your own gear” test now happens on a 6,000 m peak, where the stakes are lower.</w:t>
+      </w:r>
+    </w:p>
+    <w:p>
+      <w:pPr>
+        <w:pStyle w:val="ListParagraph"/>
+        <w:numPr>
+          <w:ilvl w:val="0"/>
+          <w:numId w:val="4"/>
+        </w:numPr>
+        <w:spacing w:after="60"/>
+      </w:pPr>
+      <w:r>
+        <w:rPr>
+          <w:b/>
+          <w:bCs/>
+        </w:rPr>
+        <w:t xml:space="preserve">The descent is now mostly about the body. </w:t>
+      </w:r>
+      <w:r>
+        <w:rPr>
+          <w:bCs/>
+        </w:rPr>
+        <w:t>Among commercial climbers since 2015, exhaustion and altitude illness caused about 70% of deaths on the way down. Experienced climbers who summited late died at about half the rate of inexperienced ones, but still at about five times the rate of early summiters. The clock applies to everyone (SG-4), and a condition check at the high-camp gate is added (SG-6).</w:t>
       </w:r>
     </w:p>
     <w:p>
@@ -12625,6 +12671,24 @@
     </w:p>
     <w:p>
       <w:pPr>
+        <w:spacing w:after="120"/>
+      </w:pPr>
+      <w:r>
+        <w:rPr>
+          <w:b/>
+          <w:bCs/>
+        </w:rPr>
+        <w:t xml:space="preserve">Hazard follows the record. </w:t>
+      </w:r>
+      <w:r>
+        <w:rPr>
+          <w:bCs/>
+        </w:rPr>
+        <w:t>The hazard score must reflect each peak’s death record, not only its height. Some 7,000 m peaks, such as Pumori, Tilicho and Annapurna IV, kill 5 to 7 climbers per 100 summits (1990–2025), more than Everest (about 2). They score high on hazard so the ladder never steers anyone to them for easy Tier 3 points. The commercial 7,000 m peaks, such as Himlung, Baruntse and Putha Hiunchuli, are among the safest high peaks in Nepal (5 deaths in more than 4,000 climbs).</w:t>
+      </w:r>
+    </w:p>
+    <w:p>
+      <w:pPr>
         <w:pStyle w:val="Heading1"/>
       </w:pPr>
       <w:r>
@@ -12675,6 +12739,25 @@
           <w:szCs w:val="20"/>
         </w:rPr>
         <w:t>Version 3 (24 Oct 2026): the no-oxygen qualifier and the oxygen-start rule are removed. PB-4 now denies credit for late summits, PB-7 requires logged summit and turnaround times, and the summit-day clock becomes the core safety control (see 1.1).</w:t>
+      </w:r>
+    </w:p>
+    <w:p>
+      <w:pPr>
+        <w:pBdr>
+          <w:left w:val="single" w:color="C9A227" w:sz="18" w:space="6"/>
+        </w:pBdr>
+        <w:shd w:fill="FFF4D6" w:color="auto" w:val="clear"/>
+        <w:spacing w:after="160" w:before="60"/>
+        <w:ind w:left="120"/>
+      </w:pPr>
+      <w:r>
+        <w:rPr>
+          <w:i/>
+          <w:iCs/>
+          <w:sz w:val="20"/>
+          <w:szCs w:val="20"/>
+        </w:rPr>
+        <w:t>Version 3.1 (24 Oct 2026): the lean qualifier moves from Tier 3 to Tier 2; every qualifying peak gets a posted turnaround time (PB-4); veterans get no turnaround exemption (SG-4); a condition and pace check is added at the high-camp gate (SG-6); and the PRI hazard score must reflect each peak’s death record (section 4, “Hazard follows the record”). See 1.1.</w:t>
       </w:r>
     </w:p>
     <w:p>
@@ -13753,7 +13836,7 @@
                 <w:sz w:val="17"/>
                 <w:szCs w:val="17"/>
               </w:rPr>
-              <w:t>One T3 on a lean expedition: no better than 1 staff per 2 members below high camp, climber carries own personal gear. Every qualifying summit must be reached before the peak’s posted turnaround time</w:t>
+              <w:t>One T2 on a lean expedition: no better than 1 staff per 2 members below high camp, climber carries own personal gear (moved from T3 in v3.1). Every qualifying summit must be reached before the peak’s posted turnaround time</w:t>
             </w:r>
           </w:p>
         </w:tc>
@@ -15053,10 +15136,10 @@
           <w:b/>
           <w:bCs/>
         </w:rPr>
-        <w:t xml:space="preserve">Example Everest path (v3): </w:t>
-      </w:r>
-      <w:r>
-        <w:t>Island Peak (32.7) → Lobuche East (34.2, AD−) → Aconcagua (37.6) → Putha Hiunchuli (46.5) → Baruntse (51.3, lean expedition) → Ama Dablam (56.1, D+) = 258.4 points and roughly 85–95 nights above 5,000 m. A currency expedition or a turnaround attempt makes up the remaining nights. Manaslu (62.6, 8,000 m) can replace Ama Dablam for 264.9 points. Two of the qualifiers are in Nepal. A sample schedule inside the 3 years: Island Peak (autumn, Year 1) · Aconcagua (southern summer) · Lobuche East and Putha Hiunchuli (spring, Year 2) · Ama Dablam and Baruntse (autumn, Year 2) · a currency trip in Year 3 to build nights. The climber applies once 36 months have passed since the Island Peak summit.</w:t>
+        <w:t xml:space="preserve">Example Everest path (v3.1): </w:t>
+      </w:r>
+      <w:r>
+        <w:t>Island Peak (32.7) → Lobuche East (34.2, AD−, lean expedition) → Aconcagua (37.6) → Putha Hiunchuli (46.5) → Baruntse (51.3) → Ama Dablam (56.1, D+) = 258.4 points and roughly 85–95 nights above 5,000 m. A currency expedition or a turnaround attempt makes up the remaining nights. Manaslu (62.6, 8,000 m) can replace Ama Dablam for 264.9 points. Two of the qualifiers are in Nepal. A sample schedule inside the 3 years: Island Peak (autumn, Year 1) · Aconcagua (southern summer) · Lobuche East and Putha Hiunchuli (spring, Year 2) · Ama Dablam and Baruntse (autumn, Year 2) · a currency trip in Year 3 to build nights. The climber applies once 36 months have passed since the Island Peak summit.</w:t>
       </w:r>
     </w:p>
     <w:p>
@@ -15152,7 +15235,7 @@
         <w:t xml:space="preserve">PB-4	</w:t>
       </w:r>
       <w:r>
-        <w:t>Late summits earn no credit. A qualifying summit reached after the peak’s posted turnaround time, as logged by tracker, earns no points, even if the climber gets down safely. Nights on the climb still count.</w:t>
+        <w:t>Late summits earn no credit. Every qualifying peak has a posted turnaround time, published by the Rating Panel with the PRI table. A qualifying summit reached after it, as logged by tracker, earns no points, even if the climber gets down safely. On the non-commercial 7,000 m peaks, 41% of summits now come after noon. Nights on the climb still count.</w:t>
       </w:r>
     </w:p>
     <w:p>
@@ -17684,7 +17767,7 @@
         <w:t xml:space="preserve">Base Camp re-check: </w:t>
       </w:r>
       <w:r>
-        <w:t xml:space="preserve">before the summit-slot draw, the Base Camp clinic (e.g., Everest ER/HRA) checks SpO₂ trend, weight loss, cough and neuro status. Only a climber who passes enters the slot lottery.</w:t>
+        <w:t>before the summit-slot draw, the Base Camp clinic (e.g., Everest ER/HRA) checks SpO₂ trend, weight loss, cough and neuro status. Only a climber who passes enters the slot lottery. A second, shorter check happens at the high-camp gate on summit night (SG-6).</w:t>
       </w:r>
     </w:p>
     <w:p>
@@ -23180,7 +23263,7 @@
         <w:t xml:space="preserve">Hard turnaround: </w:t>
       </w:r>
       <w:r>
-        <w:t>South Summit checkpoint by 09:00 and summit by 11:00, or turn back. Times are logged by tracker. This is the core safety control: since 2010, climbers who summited after 11:00 died on the descent at about eight times the rate of earlier summiters (28 vs 3.6 per 1,000).</w:t>
+        <w:t>South Summit checkpoint by 09:00 and summit by 11:00, or turn back. Times are logged by tracker. This is the core safety control: since 2010, climbers who summited after 11:00 died on the descent at about eight times the rate of earlier summiters (28 vs 3.6 per 1,000). There is no exemption for experience: veterans who summited late still died on the descent at about five times the rate of early summiters.</w:t>
       </w:r>
     </w:p>
     <w:p>
@@ -23208,6 +23291,39 @@
       </w:r>
       <w:r>
         <w:t xml:space="preserve">if fewer days open than slots were needed, unfilled tags move to the force-majeure pool for next season. No tag holder may simply add themselves to a day.</w:t>
+      </w:r>
+    </w:p>
+    <w:p>
+      <w:pPr>
+        <w:tabs>
+          <w:tab w:val="left" w:pos="720"/>
+        </w:tabs>
+        <w:spacing w:after="100"/>
+        <w:ind w:left="720" w:hanging="720"/>
+      </w:pPr>
+      <w:r>
+        <w:rPr>
+          <w:b/>
+          <w:bCs/>
+          <w:color w:val="1F3864"/>
+        </w:rPr>
+        <w:t>SG-6</w:t>
+        <w:tab/>
+      </w:r>
+      <w:r>
+        <w:rPr>
+          <w:b/>
+          <w:bCs/>
+          <w:color w:val="1F3864"/>
+        </w:rPr>
+        <w:t xml:space="preserve">Condition check at the high-camp gate: </w:t>
+      </w:r>
+      <w:r>
+        <w:rPr>
+          <w:bCs/>
+          <w:color w:val="1F3864"/>
+        </w:rPr>
+        <w:t>before leaving camp, every climber is checked by their guide and the gate ranger for signs of exhaustion and altitude illness. A climber who needs help to move, or who misses a pace checkpoint on the way up, turns back. Exhaustion and altitude illness now cause about 70% of descent deaths among commercial climbers.</w:t>
       </w:r>
     </w:p>
     <w:p>

</xml_diff>